<commit_message>
Update résumé: Aurora 1 year, add Super Daddy freelance role
Co-Authored-By: Claude Opus 5.5 <noreply@anthropic.com>
Claude-Session: https://claude.ai/code/session_01EPMuR69G9Aua2vwccWzjM1
</commit_message>
<xml_diff>
--- a/assets/resume/Mj-Mallorca-Resume.docx
+++ b/assets/resume/Mj-Mallorca-Resume.docx
@@ -59,7 +59,7 @@
         </w:rPr>
         <w:t xml:space="preserve">  |  </w:t>
       </w:r>
-      <w:hyperlink w:history="1" r:id="rIdee9enu63yzg4mqbgcm9yl">
+      <w:hyperlink w:history="1" r:id="rId9wqv5b9ciol75_dywwaqn">
         <w:r>
           <w:rPr>
             <w:rFonts w:ascii="Calibri" w:cs="Calibri" w:eastAsia="Calibri" w:hAnsi="Calibri"/>
@@ -77,7 +77,7 @@
         <w:spacing w:after="60"/>
         <w:jc w:val="center"/>
       </w:pPr>
-      <w:hyperlink w:history="1" r:id="rIdl_axttwfshmw38e1x8xdx">
+      <w:hyperlink w:history="1" r:id="rIdcdpjit1qi_podeanork5r">
         <w:r>
           <w:rPr>
             <w:rFonts w:ascii="Calibri" w:cs="Calibri" w:eastAsia="Calibri" w:hAnsi="Calibri"/>
@@ -98,7 +98,7 @@
         </w:rPr>
         <w:t xml:space="preserve">  |  </w:t>
       </w:r>
-      <w:hyperlink w:history="1" r:id="rIdsvijq6-d9lrwy5nsbkolu">
+      <w:hyperlink w:history="1" r:id="rIdh81oo16-hmq7_hkbxt-i8">
         <w:r>
           <w:rPr>
             <w:rFonts w:ascii="Calibri" w:cs="Calibri" w:eastAsia="Calibri" w:hAnsi="Calibri"/>
@@ -119,7 +119,7 @@
         </w:rPr>
         <w:t xml:space="preserve">  |  </w:t>
       </w:r>
-      <w:hyperlink w:history="1" r:id="rIdzpwrnhuvpszl-brq3kvr7">
+      <w:hyperlink w:history="1" r:id="rIdoaf7_d3iqmh5pfsnvlxuf">
         <w:r>
           <w:rPr>
             <w:rFonts w:ascii="Calibri" w:cs="Calibri" w:eastAsia="Calibri" w:hAnsi="Calibri"/>
@@ -162,7 +162,7 @@
           <w:sz w:val="21"/>
           <w:szCs w:val="21"/>
         </w:rPr>
-        <w:t xml:space="preserve">Information Technology student and graphic designer who designs accessible digital interfaces and builds responsive front-end web applications that align with real business needs. Combines active graphic design work for an MPL Philippines esports team with hands-on IT and network support experience, turning complex requirements into clear visual prototypes, polished layouts and clean, scalable front-end code.</w:t>
+        <w:t xml:space="preserve">Information Technology student and graphic designer who designs accessible digital interfaces and builds responsive front-end web applications that align with real business needs. Brings a year of graphic design for an MPL Philippines esports team, freelance product design for a milk tea brand, and hands-on IT and network support experience, turning complex requirements into clear visual prototypes, polished layouts and clean, scalable front-end code.</w:t>
       </w:r>
     </w:p>
     <w:p>
@@ -211,7 +211,7 @@
           <w:sz w:val="21"/>
           <w:szCs w:val="21"/>
         </w:rPr>
-        <w:t xml:space="preserve">	Feb 2026 – Present</w:t>
+        <w:t xml:space="preserve">	Oct 2025 – Present (1 yr)</w:t>
       </w:r>
     </w:p>
     <w:p>
@@ -287,34 +287,18 @@
           <w:sz w:val="21"/>
           <w:szCs w:val="21"/>
         </w:rPr>
-        <w:t xml:space="preserve">Technical &amp; Network Support Intern — PTSI Philippines</w:t>
-      </w:r>
-      <w:r>
-        <w:rPr>
-          <w:rFonts w:ascii="Calibri" w:cs="Calibri" w:eastAsia="Calibri" w:hAnsi="Calibri"/>
-          <w:b/>
-          <w:bCs/>
-          <w:color w:val="000000"/>
-          <w:sz w:val="21"/>
-          <w:szCs w:val="21"/>
-        </w:rPr>
-        <w:t xml:space="preserve">	Jun 2026 – Oct 2026</w:t>
-      </w:r>
-    </w:p>
-    <w:p>
-      <w:pPr>
-        <w:spacing w:after="40"/>
-      </w:pPr>
-      <w:r>
-        <w:rPr>
-          <w:rFonts w:ascii="Calibri" w:cs="Calibri" w:eastAsia="Calibri" w:hAnsi="Calibri"/>
-          <w:i/>
-          <w:iCs/>
-          <w:color w:val="000000"/>
-          <w:sz w:val="21"/>
-          <w:szCs w:val="21"/>
-        </w:rPr>
-        <w:t xml:space="preserve">Productivity Technologies Services, Inc.</w:t>
+        <w:t xml:space="preserve">Freelance Graphic Designer — Super Daddy Milk Tea Shop</w:t>
+      </w:r>
+      <w:r>
+        <w:rPr>
+          <w:rFonts w:ascii="Calibri" w:cs="Calibri" w:eastAsia="Calibri" w:hAnsi="Calibri"/>
+          <w:b/>
+          <w:bCs/>
+          <w:color w:val="000000"/>
+          <w:sz w:val="21"/>
+          <w:szCs w:val="21"/>
+        </w:rPr>
+        <w:t xml:space="preserve">	May 2026 – Oct 2026 (6 mos)</w:t>
       </w:r>
     </w:p>
     <w:p>
@@ -333,56 +317,7 @@
           <w:sz w:val="21"/>
           <w:szCs w:val="21"/>
         </w:rPr>
-        <w:t xml:space="preserve">Supported day-to-day IT operations, troubleshooting hardware, software and network issues.</w:t>
-      </w:r>
-    </w:p>
-    <w:p>
-      <w:pPr>
-        <w:pBdr>
-          <w:bottom w:val="single" w:color="8E1616" w:sz="6" w:space="2"/>
-        </w:pBdr>
-        <w:spacing w:after="80" w:before="220"/>
-      </w:pPr>
-      <w:r>
-        <w:rPr>
-          <w:rFonts w:ascii="Calibri" w:cs="Calibri" w:eastAsia="Calibri" w:hAnsi="Calibri"/>
-          <w:b/>
-          <w:bCs/>
-          <w:color w:val="8E1616"/>
-          <w:sz w:val="23"/>
-          <w:szCs w:val="23"/>
-        </w:rPr>
-        <w:t xml:space="preserve">PROJECTS</w:t>
-      </w:r>
-    </w:p>
-    <w:p>
-      <w:pPr>
-        <w:tabs>
-          <w:tab w:val="right" w:pos="10466"/>
-        </w:tabs>
-        <w:spacing w:after="0" w:before="120"/>
-      </w:pPr>
-      <w:r>
-        <w:rPr>
-          <w:rFonts w:ascii="Calibri" w:cs="Calibri" w:eastAsia="Calibri" w:hAnsi="Calibri"/>
-          <w:b/>
-          <w:bCs/>
-          <w:color w:val="000000"/>
-          <w:sz w:val="21"/>
-          <w:szCs w:val="21"/>
-        </w:rPr>
-        <w:t xml:space="preserve">PTSI Corporate Website — Web Designer &amp; Developer</w:t>
-      </w:r>
-      <w:r>
-        <w:rPr>
-          <w:rFonts w:ascii="Calibri" w:cs="Calibri" w:eastAsia="Calibri" w:hAnsi="Calibri"/>
-          <w:b/>
-          <w:bCs/>
-          <w:color w:val="000000"/>
-          <w:sz w:val="21"/>
-          <w:szCs w:val="21"/>
-        </w:rPr>
-        <w:t xml:space="preserve">	2026</w:t>
+        <w:t xml:space="preserve">Designed product posters for the shop’s milk tea, cheesecake, coffee and frappe line, including Oreo, Red Velvet, Classic, Iced Latte, Matcha and Mango drinks.</w:t>
       </w:r>
     </w:p>
     <w:p>
@@ -401,6 +336,139 @@
           <w:sz w:val="21"/>
           <w:szCs w:val="21"/>
         </w:rPr>
+        <w:t xml:space="preserve">Created social media promotions with product photo retouching, price callouts and bilingual (English–Filipino) copy, giving each drink its own bold color theme.</w:t>
+      </w:r>
+    </w:p>
+    <w:p>
+      <w:pPr>
+        <w:tabs>
+          <w:tab w:val="right" w:pos="10466"/>
+        </w:tabs>
+        <w:spacing w:after="0" w:before="120"/>
+      </w:pPr>
+      <w:r>
+        <w:rPr>
+          <w:rFonts w:ascii="Calibri" w:cs="Calibri" w:eastAsia="Calibri" w:hAnsi="Calibri"/>
+          <w:b/>
+          <w:bCs/>
+          <w:color w:val="000000"/>
+          <w:sz w:val="21"/>
+          <w:szCs w:val="21"/>
+        </w:rPr>
+        <w:t xml:space="preserve">Technical &amp; Network Support Intern — PTSI Philippines</w:t>
+      </w:r>
+      <w:r>
+        <w:rPr>
+          <w:rFonts w:ascii="Calibri" w:cs="Calibri" w:eastAsia="Calibri" w:hAnsi="Calibri"/>
+          <w:b/>
+          <w:bCs/>
+          <w:color w:val="000000"/>
+          <w:sz w:val="21"/>
+          <w:szCs w:val="21"/>
+        </w:rPr>
+        <w:t xml:space="preserve">	Jun 2026 – Oct 2026</w:t>
+      </w:r>
+    </w:p>
+    <w:p>
+      <w:pPr>
+        <w:spacing w:after="40"/>
+      </w:pPr>
+      <w:r>
+        <w:rPr>
+          <w:rFonts w:ascii="Calibri" w:cs="Calibri" w:eastAsia="Calibri" w:hAnsi="Calibri"/>
+          <w:i/>
+          <w:iCs/>
+          <w:color w:val="000000"/>
+          <w:sz w:val="21"/>
+          <w:szCs w:val="21"/>
+        </w:rPr>
+        <w:t xml:space="preserve">Productivity Technologies Services, Inc.</w:t>
+      </w:r>
+    </w:p>
+    <w:p>
+      <w:pPr>
+        <w:pStyle w:val="ListParagraph"/>
+        <w:numPr>
+          <w:ilvl w:val="0"/>
+          <w:numId w:val="2"/>
+        </w:numPr>
+        <w:spacing w:after="40"/>
+      </w:pPr>
+      <w:r>
+        <w:rPr>
+          <w:rFonts w:ascii="Calibri" w:cs="Calibri" w:eastAsia="Calibri" w:hAnsi="Calibri"/>
+          <w:color w:val="000000"/>
+          <w:sz w:val="21"/>
+          <w:szCs w:val="21"/>
+        </w:rPr>
+        <w:t xml:space="preserve">Supported day-to-day IT operations, troubleshooting hardware, software and network issues.</w:t>
+      </w:r>
+    </w:p>
+    <w:p>
+      <w:pPr>
+        <w:pBdr>
+          <w:bottom w:val="single" w:color="8E1616" w:sz="6" w:space="2"/>
+        </w:pBdr>
+        <w:spacing w:after="80" w:before="220"/>
+      </w:pPr>
+      <w:r>
+        <w:rPr>
+          <w:rFonts w:ascii="Calibri" w:cs="Calibri" w:eastAsia="Calibri" w:hAnsi="Calibri"/>
+          <w:b/>
+          <w:bCs/>
+          <w:color w:val="8E1616"/>
+          <w:sz w:val="23"/>
+          <w:szCs w:val="23"/>
+        </w:rPr>
+        <w:t xml:space="preserve">PROJECTS</w:t>
+      </w:r>
+    </w:p>
+    <w:p>
+      <w:pPr>
+        <w:tabs>
+          <w:tab w:val="right" w:pos="10466"/>
+        </w:tabs>
+        <w:spacing w:after="0" w:before="120"/>
+      </w:pPr>
+      <w:r>
+        <w:rPr>
+          <w:rFonts w:ascii="Calibri" w:cs="Calibri" w:eastAsia="Calibri" w:hAnsi="Calibri"/>
+          <w:b/>
+          <w:bCs/>
+          <w:color w:val="000000"/>
+          <w:sz w:val="21"/>
+          <w:szCs w:val="21"/>
+        </w:rPr>
+        <w:t xml:space="preserve">PTSI Corporate Website — Web Designer &amp; Developer</w:t>
+      </w:r>
+      <w:r>
+        <w:rPr>
+          <w:rFonts w:ascii="Calibri" w:cs="Calibri" w:eastAsia="Calibri" w:hAnsi="Calibri"/>
+          <w:b/>
+          <w:bCs/>
+          <w:color w:val="000000"/>
+          <w:sz w:val="21"/>
+          <w:szCs w:val="21"/>
+        </w:rPr>
+        <w:t xml:space="preserve">	2026</w:t>
+      </w:r>
+    </w:p>
+    <w:p>
+      <w:pPr>
+        <w:pStyle w:val="ListParagraph"/>
+        <w:numPr>
+          <w:ilvl w:val="0"/>
+          <w:numId w:val="2"/>
+        </w:numPr>
+        <w:spacing w:after="40"/>
+      </w:pPr>
+      <w:r>
+        <w:rPr>
+          <w:rFonts w:ascii="Calibri" w:cs="Calibri" w:eastAsia="Calibri" w:hAnsi="Calibri"/>
+          <w:color w:val="000000"/>
+          <w:sz w:val="21"/>
+          <w:szCs w:val="21"/>
+        </w:rPr>
         <w:t xml:space="preserve">Designed and developed a responsive corporate website for an IT products and services company, covering About Us, Partners, Products, Services, News, Careers and Contact.</w:t>
       </w:r>
     </w:p>
@@ -419,7 +487,7 @@
         </w:rPr>
         <w:t xml:space="preserve">Live: </w:t>
       </w:r>
-      <w:hyperlink w:history="1" r:id="rId_8pzrjrbekcqidtbwmaqb">
+      <w:hyperlink w:history="1" r:id="rIdyivsyo9rdyxhbz6utnlgq">
         <w:r>
           <w:rPr>
             <w:rFonts w:ascii="Calibri" w:cs="Calibri" w:eastAsia="Calibri" w:hAnsi="Calibri"/>
@@ -496,7 +564,7 @@
         </w:rPr>
         <w:t xml:space="preserve">Live: </w:t>
       </w:r>
-      <w:hyperlink w:history="1" r:id="rIda-lirz-vgodxy9bd1ywrf">
+      <w:hyperlink w:history="1" r:id="rIdkodbuuc10e_g1dug6k0ce">
         <w:r>
           <w:rPr>
             <w:rFonts w:ascii="Calibri" w:cs="Calibri" w:eastAsia="Calibri" w:hAnsi="Calibri"/>

</xml_diff>

<commit_message>
Super Daddy freelance dates: Aug 2025 – Feb 2026
Update the résumé (reordered experience by date) and the portfolio's
Super Daddy project year and role.

Co-Authored-By: Claude Opus 5.5 <noreply@anthropic.com>
Claude-Session: https://claude.ai/code/session_01EPMuR69G9Aua2vwccWzjM1
</commit_message>
<xml_diff>
--- a/assets/resume/Mj-Mallorca-Resume.docx
+++ b/assets/resume/Mj-Mallorca-Resume.docx
@@ -59,7 +59,7 @@
         </w:rPr>
         <w:t xml:space="preserve">  |  </w:t>
       </w:r>
-      <w:hyperlink w:history="1" r:id="rId9wqv5b9ciol75_dywwaqn">
+      <w:hyperlink w:history="1" r:id="rIdvvtgxmu-kz4nn8bwd67zz">
         <w:r>
           <w:rPr>
             <w:rFonts w:ascii="Calibri" w:cs="Calibri" w:eastAsia="Calibri" w:hAnsi="Calibri"/>
@@ -77,7 +77,7 @@
         <w:spacing w:after="60"/>
         <w:jc w:val="center"/>
       </w:pPr>
-      <w:hyperlink w:history="1" r:id="rIdcdpjit1qi_podeanork5r">
+      <w:hyperlink w:history="1" r:id="rIdaktvaey9v_xieow640dz9">
         <w:r>
           <w:rPr>
             <w:rFonts w:ascii="Calibri" w:cs="Calibri" w:eastAsia="Calibri" w:hAnsi="Calibri"/>
@@ -98,7 +98,7 @@
         </w:rPr>
         <w:t xml:space="preserve">  |  </w:t>
       </w:r>
-      <w:hyperlink w:history="1" r:id="rIdh81oo16-hmq7_hkbxt-i8">
+      <w:hyperlink w:history="1" r:id="rIdbzfdiqkjimduk04lz-djg">
         <w:r>
           <w:rPr>
             <w:rFonts w:ascii="Calibri" w:cs="Calibri" w:eastAsia="Calibri" w:hAnsi="Calibri"/>
@@ -119,7 +119,7 @@
         </w:rPr>
         <w:t xml:space="preserve">  |  </w:t>
       </w:r>
-      <w:hyperlink w:history="1" r:id="rIdoaf7_d3iqmh5pfsnvlxuf">
+      <w:hyperlink w:history="1" r:id="rIdimq_di-sskv7uoggm0d67">
         <w:r>
           <w:rPr>
             <w:rFonts w:ascii="Calibri" w:cs="Calibri" w:eastAsia="Calibri" w:hAnsi="Calibri"/>
@@ -287,18 +287,34 @@
           <w:sz w:val="21"/>
           <w:szCs w:val="21"/>
         </w:rPr>
-        <w:t xml:space="preserve">Freelance Graphic Designer — Super Daddy Milk Tea Shop</w:t>
-      </w:r>
-      <w:r>
-        <w:rPr>
-          <w:rFonts w:ascii="Calibri" w:cs="Calibri" w:eastAsia="Calibri" w:hAnsi="Calibri"/>
-          <w:b/>
-          <w:bCs/>
-          <w:color w:val="000000"/>
-          <w:sz w:val="21"/>
-          <w:szCs w:val="21"/>
-        </w:rPr>
-        <w:t xml:space="preserve">	May 2026 – Oct 2026 (6 mos)</w:t>
+        <w:t xml:space="preserve">Technical &amp; Network Support Intern — PTSI Philippines</w:t>
+      </w:r>
+      <w:r>
+        <w:rPr>
+          <w:rFonts w:ascii="Calibri" w:cs="Calibri" w:eastAsia="Calibri" w:hAnsi="Calibri"/>
+          <w:b/>
+          <w:bCs/>
+          <w:color w:val="000000"/>
+          <w:sz w:val="21"/>
+          <w:szCs w:val="21"/>
+        </w:rPr>
+        <w:t xml:space="preserve">	Jun 2026 – Oct 2026</w:t>
+      </w:r>
+    </w:p>
+    <w:p>
+      <w:pPr>
+        <w:spacing w:after="40"/>
+      </w:pPr>
+      <w:r>
+        <w:rPr>
+          <w:rFonts w:ascii="Calibri" w:cs="Calibri" w:eastAsia="Calibri" w:hAnsi="Calibri"/>
+          <w:i/>
+          <w:iCs/>
+          <w:color w:val="000000"/>
+          <w:sz w:val="21"/>
+          <w:szCs w:val="21"/>
+        </w:rPr>
+        <w:t xml:space="preserve">Productivity Technologies Services, Inc.</w:t>
       </w:r>
     </w:p>
     <w:p>
@@ -317,7 +333,37 @@
           <w:sz w:val="21"/>
           <w:szCs w:val="21"/>
         </w:rPr>
-        <w:t xml:space="preserve">Designed product posters for the shop’s milk tea, cheesecake, coffee and frappe line, including Oreo, Red Velvet, Classic, Iced Latte, Matcha and Mango drinks.</w:t>
+        <w:t xml:space="preserve">Supported day-to-day IT operations, troubleshooting hardware, software and network issues.</w:t>
+      </w:r>
+    </w:p>
+    <w:p>
+      <w:pPr>
+        <w:tabs>
+          <w:tab w:val="right" w:pos="10466"/>
+        </w:tabs>
+        <w:spacing w:after="0" w:before="120"/>
+      </w:pPr>
+      <w:r>
+        <w:rPr>
+          <w:rFonts w:ascii="Calibri" w:cs="Calibri" w:eastAsia="Calibri" w:hAnsi="Calibri"/>
+          <w:b/>
+          <w:bCs/>
+          <w:color w:val="000000"/>
+          <w:sz w:val="21"/>
+          <w:szCs w:val="21"/>
+        </w:rPr>
+        <w:t xml:space="preserve">Freelance Graphic Designer — Super Daddy Milk Tea Shop</w:t>
+      </w:r>
+      <w:r>
+        <w:rPr>
+          <w:rFonts w:ascii="Calibri" w:cs="Calibri" w:eastAsia="Calibri" w:hAnsi="Calibri"/>
+          <w:b/>
+          <w:bCs/>
+          <w:color w:val="000000"/>
+          <w:sz w:val="21"/>
+          <w:szCs w:val="21"/>
+        </w:rPr>
+        <w:t xml:space="preserve">	Aug 2025 – Feb 2026 (6 mos)</w:t>
       </w:r>
     </w:p>
     <w:p>
@@ -336,53 +382,7 @@
           <w:sz w:val="21"/>
           <w:szCs w:val="21"/>
         </w:rPr>
-        <w:t xml:space="preserve">Created social media promotions with product photo retouching, price callouts and bilingual (English–Filipino) copy, giving each drink its own bold color theme.</w:t>
-      </w:r>
-    </w:p>
-    <w:p>
-      <w:pPr>
-        <w:tabs>
-          <w:tab w:val="right" w:pos="10466"/>
-        </w:tabs>
-        <w:spacing w:after="0" w:before="120"/>
-      </w:pPr>
-      <w:r>
-        <w:rPr>
-          <w:rFonts w:ascii="Calibri" w:cs="Calibri" w:eastAsia="Calibri" w:hAnsi="Calibri"/>
-          <w:b/>
-          <w:bCs/>
-          <w:color w:val="000000"/>
-          <w:sz w:val="21"/>
-          <w:szCs w:val="21"/>
-        </w:rPr>
-        <w:t xml:space="preserve">Technical &amp; Network Support Intern — PTSI Philippines</w:t>
-      </w:r>
-      <w:r>
-        <w:rPr>
-          <w:rFonts w:ascii="Calibri" w:cs="Calibri" w:eastAsia="Calibri" w:hAnsi="Calibri"/>
-          <w:b/>
-          <w:bCs/>
-          <w:color w:val="000000"/>
-          <w:sz w:val="21"/>
-          <w:szCs w:val="21"/>
-        </w:rPr>
-        <w:t xml:space="preserve">	Jun 2026 – Oct 2026</w:t>
-      </w:r>
-    </w:p>
-    <w:p>
-      <w:pPr>
-        <w:spacing w:after="40"/>
-      </w:pPr>
-      <w:r>
-        <w:rPr>
-          <w:rFonts w:ascii="Calibri" w:cs="Calibri" w:eastAsia="Calibri" w:hAnsi="Calibri"/>
-          <w:i/>
-          <w:iCs/>
-          <w:color w:val="000000"/>
-          <w:sz w:val="21"/>
-          <w:szCs w:val="21"/>
-        </w:rPr>
-        <w:t xml:space="preserve">Productivity Technologies Services, Inc.</w:t>
+        <w:t xml:space="preserve">Designed product posters for the shop’s milk tea, cheesecake, coffee and frappe line, including Oreo, Red Velvet, Classic, Iced Latte, Matcha and Mango drinks.</w:t>
       </w:r>
     </w:p>
     <w:p>
@@ -401,7 +401,7 @@
           <w:sz w:val="21"/>
           <w:szCs w:val="21"/>
         </w:rPr>
-        <w:t xml:space="preserve">Supported day-to-day IT operations, troubleshooting hardware, software and network issues.</w:t>
+        <w:t xml:space="preserve">Created social media promotions with product photo retouching, price callouts and bilingual (English–Filipino) copy, giving each drink its own bold color theme.</w:t>
       </w:r>
     </w:p>
     <w:p>
@@ -487,7 +487,7 @@
         </w:rPr>
         <w:t xml:space="preserve">Live: </w:t>
       </w:r>
-      <w:hyperlink w:history="1" r:id="rIdyivsyo9rdyxhbz6utnlgq">
+      <w:hyperlink w:history="1" r:id="rIdmi8gmturx_exikz_1bbp6">
         <w:r>
           <w:rPr>
             <w:rFonts w:ascii="Calibri" w:cs="Calibri" w:eastAsia="Calibri" w:hAnsi="Calibri"/>
@@ -564,7 +564,7 @@
         </w:rPr>
         <w:t xml:space="preserve">Live: </w:t>
       </w:r>
-      <w:hyperlink w:history="1" r:id="rIdkodbuuc10e_g1dug6k0ce">
+      <w:hyperlink w:history="1" r:id="rIdy5kvww05eypizerpapkjv">
         <w:r>
           <w:rPr>
             <w:rFonts w:ascii="Calibri" w:cs="Calibri" w:eastAsia="Calibri" w:hAnsi="Calibri"/>

</xml_diff>

<commit_message>
Résumé: drop the Road to 100K campaign from the Aurora bullets
Co-Authored-By: Claude Opus 5.5 <noreply@anthropic.com>
Claude-Session: https://claude.ai/code/session_01EPMuR69G9Aua2vwccWzjM1
</commit_message>
<xml_diff>
--- a/assets/resume/Mj-Mallorca-Resume.docx
+++ b/assets/resume/Mj-Mallorca-Resume.docx
@@ -59,7 +59,7 @@
         </w:rPr>
         <w:t xml:space="preserve">  |  </w:t>
       </w:r>
-      <w:hyperlink w:history="1" r:id="rIdvvtgxmu-kz4nn8bwd67zz">
+      <w:hyperlink w:history="1" r:id="rIdyapinwr2qkz7dlb7u0cfe">
         <w:r>
           <w:rPr>
             <w:rFonts w:ascii="Calibri" w:cs="Calibri" w:eastAsia="Calibri" w:hAnsi="Calibri"/>
@@ -77,7 +77,7 @@
         <w:spacing w:after="60"/>
         <w:jc w:val="center"/>
       </w:pPr>
-      <w:hyperlink w:history="1" r:id="rIdaktvaey9v_xieow640dz9">
+      <w:hyperlink w:history="1" r:id="rIdrhwl_2vijfvkl0k01xwlv">
         <w:r>
           <w:rPr>
             <w:rFonts w:ascii="Calibri" w:cs="Calibri" w:eastAsia="Calibri" w:hAnsi="Calibri"/>
@@ -98,7 +98,7 @@
         </w:rPr>
         <w:t xml:space="preserve">  |  </w:t>
       </w:r>
-      <w:hyperlink w:history="1" r:id="rIdbzfdiqkjimduk04lz-djg">
+      <w:hyperlink w:history="1" r:id="rIdw-njew5mmav5gfbu7acl_">
         <w:r>
           <w:rPr>
             <w:rFonts w:ascii="Calibri" w:cs="Calibri" w:eastAsia="Calibri" w:hAnsi="Calibri"/>
@@ -119,7 +119,7 @@
         </w:rPr>
         <w:t xml:space="preserve">  |  </w:t>
       </w:r>
-      <w:hyperlink w:history="1" r:id="rIdimq_di-sskv7uoggm0d67">
+      <w:hyperlink w:history="1" r:id="rIdrx_uia1-dng7pxjyfquxi">
         <w:r>
           <w:rPr>
             <w:rFonts w:ascii="Calibri" w:cs="Calibri" w:eastAsia="Calibri" w:hAnsi="Calibri"/>
@@ -249,7 +249,7 @@
           <w:sz w:val="21"/>
           <w:szCs w:val="21"/>
         </w:rPr>
-        <w:t xml:space="preserve">Create the “Road to 100K” follower-milestone campaign and Mobile Legends hero build and emblem guides featuring the team roster.</w:t>
+        <w:t xml:space="preserve">Create Mobile Legends hero build and emblem guides featuring the team roster.</w:t>
       </w:r>
     </w:p>
     <w:p>
@@ -487,7 +487,7 @@
         </w:rPr>
         <w:t xml:space="preserve">Live: </w:t>
       </w:r>
-      <w:hyperlink w:history="1" r:id="rIdmi8gmturx_exikz_1bbp6">
+      <w:hyperlink w:history="1" r:id="rIdsssdvxzrwdnvrmspzlgu7">
         <w:r>
           <w:rPr>
             <w:rFonts w:ascii="Calibri" w:cs="Calibri" w:eastAsia="Calibri" w:hAnsi="Calibri"/>
@@ -564,7 +564,7 @@
         </w:rPr>
         <w:t xml:space="preserve">Live: </w:t>
       </w:r>
-      <w:hyperlink w:history="1" r:id="rIdy5kvww05eypizerpapkjv">
+      <w:hyperlink w:history="1" r:id="rIdi5_eahgfbwru29y9aiept">
         <w:r>
           <w:rPr>
             <w:rFonts w:ascii="Calibri" w:cs="Calibri" w:eastAsia="Calibri" w:hAnsi="Calibri"/>

</xml_diff>

<commit_message>
Update downloadable résumé to the edited version
Mirror the user's edits: new title line, International Esports wording,
Aurora as a freelance role, reordered experience, PTSI website bullet,
reworded BSAid, Certifications section removed.

Co-Authored-By: Claude Opus 5.5 <noreply@anthropic.com>
Claude-Session: https://claude.ai/code/session_01EPMuR69G9Aua2vwccWzjM1
</commit_message>
<xml_diff>
--- a/assets/resume/Mj-Mallorca-Resume.docx
+++ b/assets/resume/Mj-Mallorca-Resume.docx
@@ -33,7 +33,7 @@
           <w:sz w:val="22"/>
           <w:szCs w:val="22"/>
         </w:rPr>
-        <w:t xml:space="preserve">Graphic Designer  |  IT &amp; Network Support  |  Web Designer &amp; Developer</w:t>
+        <w:t xml:space="preserve">Graphic Designer  |  Web Designer &amp; Developer</w:t>
       </w:r>
     </w:p>
     <w:p>
@@ -59,7 +59,7 @@
         </w:rPr>
         <w:t xml:space="preserve">  |  </w:t>
       </w:r>
-      <w:hyperlink w:history="1" r:id="rIdyapinwr2qkz7dlb7u0cfe">
+      <w:hyperlink w:history="1" r:id="rIdfqxus6i-jy0cq8l88nbek">
         <w:r>
           <w:rPr>
             <w:rFonts w:ascii="Calibri" w:cs="Calibri" w:eastAsia="Calibri" w:hAnsi="Calibri"/>
@@ -77,7 +77,7 @@
         <w:spacing w:after="60"/>
         <w:jc w:val="center"/>
       </w:pPr>
-      <w:hyperlink w:history="1" r:id="rIdrhwl_2vijfvkl0k01xwlv">
+      <w:hyperlink w:history="1" r:id="rIdzg8iiafbdtx_5pbyndc0_">
         <w:r>
           <w:rPr>
             <w:rFonts w:ascii="Calibri" w:cs="Calibri" w:eastAsia="Calibri" w:hAnsi="Calibri"/>
@@ -98,7 +98,7 @@
         </w:rPr>
         <w:t xml:space="preserve">  |  </w:t>
       </w:r>
-      <w:hyperlink w:history="1" r:id="rIdw-njew5mmav5gfbu7acl_">
+      <w:hyperlink w:history="1" r:id="rIdvyx1_0wm1mybczb7tq9wv">
         <w:r>
           <w:rPr>
             <w:rFonts w:ascii="Calibri" w:cs="Calibri" w:eastAsia="Calibri" w:hAnsi="Calibri"/>
@@ -119,7 +119,7 @@
         </w:rPr>
         <w:t xml:space="preserve">  |  </w:t>
       </w:r>
-      <w:hyperlink w:history="1" r:id="rIdrx_uia1-dng7pxjyfquxi">
+      <w:hyperlink w:history="1" r:id="rId-cnlq-5dwd8besyuxzvjw">
         <w:r>
           <w:rPr>
             <w:rFonts w:ascii="Calibri" w:cs="Calibri" w:eastAsia="Calibri" w:hAnsi="Calibri"/>
@@ -162,7 +162,7 @@
           <w:sz w:val="21"/>
           <w:szCs w:val="21"/>
         </w:rPr>
-        <w:t xml:space="preserve">Information Technology student and graphic designer who designs accessible digital interfaces and builds responsive front-end web applications that align with real business needs. Brings a year of graphic design for an MPL Philippines esports team, freelance product design for a milk tea brand, and hands-on IT and network support experience, turning complex requirements into clear visual prototypes, polished layouts and clean, scalable front-end code.</w:t>
+        <w:t xml:space="preserve">Information Technology student and graphic designer who designs accessible digital interfaces and builds responsive front-end web applications that align with real business needs. Brings a year of graphic design for an International Esports organization, freelance product design for a local milk tea brand, and hands-on IT and network support experience, turning complex requirements into clear visual prototypes, polished layouts and clean, scalable front-end code.</w:t>
       </w:r>
     </w:p>
     <w:p>
@@ -200,7 +200,7 @@
           <w:sz w:val="21"/>
           <w:szCs w:val="21"/>
         </w:rPr>
-        <w:t xml:space="preserve">Graphic Designer — Aurora Gaming</w:t>
+        <w:t xml:space="preserve">Freelance Graphic Designer — Aurora Gaming</w:t>
       </w:r>
       <w:r>
         <w:rPr>
@@ -230,7 +230,7 @@
           <w:sz w:val="21"/>
           <w:szCs w:val="21"/>
         </w:rPr>
-        <w:t xml:space="preserve">Design match-day graphics for MPL Philippines Season 18, including match results, pre-game announcements, defeat recaps and the season match schedule.</w:t>
+        <w:t xml:space="preserve">Design match-day graphics for Tournament Posting, including match results, pre-game announcements, defeat recaps and the season match schedule.</w:t>
       </w:r>
     </w:p>
     <w:p>
@@ -249,7 +249,37 @@
           <w:sz w:val="21"/>
           <w:szCs w:val="21"/>
         </w:rPr>
-        <w:t xml:space="preserve">Create Mobile Legends hero build and emblem guides featuring the team roster.</w:t>
+        <w:t xml:space="preserve">Build reusable templates so posts can be published right after each match, with sponsor-ready layouts for Aurora Esports.</w:t>
+      </w:r>
+    </w:p>
+    <w:p>
+      <w:pPr>
+        <w:tabs>
+          <w:tab w:val="right" w:pos="10466"/>
+        </w:tabs>
+        <w:spacing w:after="0" w:before="120"/>
+      </w:pPr>
+      <w:r>
+        <w:rPr>
+          <w:rFonts w:ascii="Calibri" w:cs="Calibri" w:eastAsia="Calibri" w:hAnsi="Calibri"/>
+          <w:b/>
+          <w:bCs/>
+          <w:color w:val="000000"/>
+          <w:sz w:val="21"/>
+          <w:szCs w:val="21"/>
+        </w:rPr>
+        <w:t xml:space="preserve">Freelance Graphic Designer — Super Daddy Milk Tea Shop</w:t>
+      </w:r>
+      <w:r>
+        <w:rPr>
+          <w:rFonts w:ascii="Calibri" w:cs="Calibri" w:eastAsia="Calibri" w:hAnsi="Calibri"/>
+          <w:b/>
+          <w:bCs/>
+          <w:color w:val="000000"/>
+          <w:sz w:val="21"/>
+          <w:szCs w:val="21"/>
+        </w:rPr>
+        <w:t xml:space="preserve">	Aug 2025 – Feb 2026 (6 mos)</w:t>
       </w:r>
     </w:p>
     <w:p>
@@ -268,53 +298,7 @@
           <w:sz w:val="21"/>
           <w:szCs w:val="21"/>
         </w:rPr>
-        <w:t xml:space="preserve">Build reusable templates so posts can be published right after each match, with sponsor-ready layouts for Infinix.</w:t>
-      </w:r>
-    </w:p>
-    <w:p>
-      <w:pPr>
-        <w:tabs>
-          <w:tab w:val="right" w:pos="10466"/>
-        </w:tabs>
-        <w:spacing w:after="0" w:before="120"/>
-      </w:pPr>
-      <w:r>
-        <w:rPr>
-          <w:rFonts w:ascii="Calibri" w:cs="Calibri" w:eastAsia="Calibri" w:hAnsi="Calibri"/>
-          <w:b/>
-          <w:bCs/>
-          <w:color w:val="000000"/>
-          <w:sz w:val="21"/>
-          <w:szCs w:val="21"/>
-        </w:rPr>
-        <w:t xml:space="preserve">Technical &amp; Network Support Intern — PTSI Philippines</w:t>
-      </w:r>
-      <w:r>
-        <w:rPr>
-          <w:rFonts w:ascii="Calibri" w:cs="Calibri" w:eastAsia="Calibri" w:hAnsi="Calibri"/>
-          <w:b/>
-          <w:bCs/>
-          <w:color w:val="000000"/>
-          <w:sz w:val="21"/>
-          <w:szCs w:val="21"/>
-        </w:rPr>
-        <w:t xml:space="preserve">	Jun 2026 – Oct 2026</w:t>
-      </w:r>
-    </w:p>
-    <w:p>
-      <w:pPr>
-        <w:spacing w:after="40"/>
-      </w:pPr>
-      <w:r>
-        <w:rPr>
-          <w:rFonts w:ascii="Calibri" w:cs="Calibri" w:eastAsia="Calibri" w:hAnsi="Calibri"/>
-          <w:i/>
-          <w:iCs/>
-          <w:color w:val="000000"/>
-          <w:sz w:val="21"/>
-          <w:szCs w:val="21"/>
-        </w:rPr>
-        <w:t xml:space="preserve">Productivity Technologies Services, Inc.</w:t>
+        <w:t xml:space="preserve">Designed product posters for the shop’s coffee, milk tea, and frappe lines, featuring signature flavors and seasonal drink offerings.</w:t>
       </w:r>
     </w:p>
     <w:p>
@@ -333,7 +317,7 @@
           <w:sz w:val="21"/>
           <w:szCs w:val="21"/>
         </w:rPr>
-        <w:t xml:space="preserve">Supported day-to-day IT operations, troubleshooting hardware, software and network issues.</w:t>
+        <w:t xml:space="preserve">Created social media promotions with product photo retouching, price callouts and bilingual (English–Filipino) copy, giving each drink its own bold color theme.</w:t>
       </w:r>
     </w:p>
     <w:p>
@@ -352,18 +336,34 @@
           <w:sz w:val="21"/>
           <w:szCs w:val="21"/>
         </w:rPr>
-        <w:t xml:space="preserve">Freelance Graphic Designer — Super Daddy Milk Tea Shop</w:t>
-      </w:r>
-      <w:r>
-        <w:rPr>
-          <w:rFonts w:ascii="Calibri" w:cs="Calibri" w:eastAsia="Calibri" w:hAnsi="Calibri"/>
-          <w:b/>
-          <w:bCs/>
-          <w:color w:val="000000"/>
-          <w:sz w:val="21"/>
-          <w:szCs w:val="21"/>
-        </w:rPr>
-        <w:t xml:space="preserve">	Aug 2025 – Feb 2026 (6 mos)</w:t>
+        <w:t xml:space="preserve">Technical &amp; Network Support Intern — PTSI Philippines</w:t>
+      </w:r>
+      <w:r>
+        <w:rPr>
+          <w:rFonts w:ascii="Calibri" w:cs="Calibri" w:eastAsia="Calibri" w:hAnsi="Calibri"/>
+          <w:b/>
+          <w:bCs/>
+          <w:color w:val="000000"/>
+          <w:sz w:val="21"/>
+          <w:szCs w:val="21"/>
+        </w:rPr>
+        <w:t xml:space="preserve">	Jun 2026 – Oct 2026</w:t>
+      </w:r>
+    </w:p>
+    <w:p>
+      <w:pPr>
+        <w:spacing w:after="40"/>
+      </w:pPr>
+      <w:r>
+        <w:rPr>
+          <w:rFonts w:ascii="Calibri" w:cs="Calibri" w:eastAsia="Calibri" w:hAnsi="Calibri"/>
+          <w:i/>
+          <w:iCs/>
+          <w:color w:val="000000"/>
+          <w:sz w:val="21"/>
+          <w:szCs w:val="21"/>
+        </w:rPr>
+        <w:t xml:space="preserve">Productivity Technologies Services, Inc.</w:t>
       </w:r>
     </w:p>
     <w:p>
@@ -382,7 +382,7 @@
           <w:sz w:val="21"/>
           <w:szCs w:val="21"/>
         </w:rPr>
-        <w:t xml:space="preserve">Designed product posters for the shop’s milk tea, cheesecake, coffee and frappe line, including Oreo, Red Velvet, Classic, Iced Latte, Matcha and Mango drinks.</w:t>
+        <w:t xml:space="preserve">Supported day-to-day IT operations, troubleshooting hardware, software and network issues.</w:t>
       </w:r>
     </w:p>
     <w:p>
@@ -401,7 +401,7 @@
           <w:sz w:val="21"/>
           <w:szCs w:val="21"/>
         </w:rPr>
-        <w:t xml:space="preserve">Created social media promotions with product photo retouching, price callouts and bilingual (English–Filipino) copy, giving each drink its own bold color theme.</w:t>
+        <w:t xml:space="preserve">Designed and developed the company’s official website using modern web development standards.</w:t>
       </w:r>
     </w:p>
     <w:p>
@@ -487,7 +487,7 @@
         </w:rPr>
         <w:t xml:space="preserve">Live: </w:t>
       </w:r>
-      <w:hyperlink w:history="1" r:id="rIdsssdvxzrwdnvrmspzlgu7">
+      <w:hyperlink w:history="1" r:id="rId7dxdyhbplhxcnsldqrbxz">
         <w:r>
           <w:rPr>
             <w:rFonts w:ascii="Calibri" w:cs="Calibri" w:eastAsia="Calibri" w:hAnsi="Calibri"/>
@@ -546,7 +546,7 @@
           <w:sz w:val="21"/>
           <w:szCs w:val="21"/>
         </w:rPr>
-        <w:t xml:space="preserve">Designed and built the website for a visual novel that teaches Financial Accounting and Reporting 1, with a retro pixel-art look and a keyboard-navigable, in-browser game menu.</w:t>
+        <w:t xml:space="preserve">Designed and built the website for BSA Student Thesis, with a retro pixel-art look and a keyboard-navigable, in-browser game menu.</w:t>
       </w:r>
     </w:p>
     <w:p>
@@ -564,7 +564,7 @@
         </w:rPr>
         <w:t xml:space="preserve">Live: </w:t>
       </w:r>
-      <w:hyperlink w:history="1" r:id="rIdi5_eahgfbwru29y9aiept">
+      <w:hyperlink w:history="1" r:id="rId7bl3m21wpyemm9w4jobhe">
         <w:r>
           <w:rPr>
             <w:rFonts w:ascii="Calibri" w:cs="Calibri" w:eastAsia="Calibri" w:hAnsi="Calibri"/>
@@ -689,50 +689,6 @@
           <w:szCs w:val="21"/>
         </w:rPr>
         <w:t xml:space="preserve">Information Technology — 4th Year Student</w:t>
-      </w:r>
-    </w:p>
-    <w:p>
-      <w:pPr>
-        <w:pBdr>
-          <w:bottom w:val="single" w:color="8E1616" w:sz="6" w:space="2"/>
-        </w:pBdr>
-        <w:spacing w:after="80" w:before="220"/>
-      </w:pPr>
-      <w:r>
-        <w:rPr>
-          <w:rFonts w:ascii="Calibri" w:cs="Calibri" w:eastAsia="Calibri" w:hAnsi="Calibri"/>
-          <w:b/>
-          <w:bCs/>
-          <w:color w:val="8E1616"/>
-          <w:sz w:val="23"/>
-          <w:szCs w:val="23"/>
-        </w:rPr>
-        <w:t xml:space="preserve">CERTIFICATIONS</w:t>
-      </w:r>
-    </w:p>
-    <w:p>
-      <w:pPr>
-        <w:spacing w:after="60"/>
-      </w:pPr>
-      <w:r>
-        <w:rPr>
-          <w:rFonts w:ascii="Calibri" w:cs="Calibri" w:eastAsia="Calibri" w:hAnsi="Calibri"/>
-          <w:b/>
-          <w:bCs/>
-          <w:color w:val="000000"/>
-          <w:sz w:val="21"/>
-          <w:szCs w:val="21"/>
-        </w:rPr>
-        <w:t xml:space="preserve">Networking Basics</w:t>
-      </w:r>
-      <w:r>
-        <w:rPr>
-          <w:rFonts w:ascii="Calibri" w:cs="Calibri" w:eastAsia="Calibri" w:hAnsi="Calibri"/>
-          <w:color w:val="000000"/>
-          <w:sz w:val="21"/>
-          <w:szCs w:val="21"/>
-        </w:rPr>
-        <w:t xml:space="preserve"> — Cisco Networking Academy, July 2026</w:t>
       </w:r>
     </w:p>
     <w:p>

</xml_diff>

<commit_message>
Résumé: match updated experience, add Sugar Dolls, remove Education
Aurora Oct 2024 - Present (2 yrs), Sugar Dolls and Super Daddy 1 yr
each, summary reworded, Education section removed.

Co-Authored-By: Claude Opus 5.5 <noreply@anthropic.com>
Claude-Session: https://claude.ai/code/session_01EPMuR69G9Aua2vwccWzjM1
</commit_message>
<xml_diff>
--- a/assets/resume/Mj-Mallorca-Resume.docx
+++ b/assets/resume/Mj-Mallorca-Resume.docx
@@ -59,7 +59,7 @@
         </w:rPr>
         <w:t xml:space="preserve">  |  </w:t>
       </w:r>
-      <w:hyperlink w:history="1" r:id="rIdfqxus6i-jy0cq8l88nbek">
+      <w:hyperlink w:history="1" r:id="rIdnteveuvvnqbbroqnflxmi">
         <w:r>
           <w:rPr>
             <w:rFonts w:ascii="Calibri" w:cs="Calibri" w:eastAsia="Calibri" w:hAnsi="Calibri"/>
@@ -77,7 +77,7 @@
         <w:spacing w:after="60"/>
         <w:jc w:val="center"/>
       </w:pPr>
-      <w:hyperlink w:history="1" r:id="rIdzg8iiafbdtx_5pbyndc0_">
+      <w:hyperlink w:history="1" r:id="rIdrztsqb3tjcji16tj2be7e">
         <w:r>
           <w:rPr>
             <w:rFonts w:ascii="Calibri" w:cs="Calibri" w:eastAsia="Calibri" w:hAnsi="Calibri"/>
@@ -98,7 +98,7 @@
         </w:rPr>
         <w:t xml:space="preserve">  |  </w:t>
       </w:r>
-      <w:hyperlink w:history="1" r:id="rIdvyx1_0wm1mybczb7tq9wv">
+      <w:hyperlink w:history="1" r:id="rIdqz6zu4myluynvw2z7h8cm">
         <w:r>
           <w:rPr>
             <w:rFonts w:ascii="Calibri" w:cs="Calibri" w:eastAsia="Calibri" w:hAnsi="Calibri"/>
@@ -119,7 +119,7 @@
         </w:rPr>
         <w:t xml:space="preserve">  |  </w:t>
       </w:r>
-      <w:hyperlink w:history="1" r:id="rId-cnlq-5dwd8besyuxzvjw">
+      <w:hyperlink w:history="1" r:id="rIdryehu070lx9qzs1jf-h9v">
         <w:r>
           <w:rPr>
             <w:rFonts w:ascii="Calibri" w:cs="Calibri" w:eastAsia="Calibri" w:hAnsi="Calibri"/>
@@ -162,7 +162,7 @@
           <w:sz w:val="21"/>
           <w:szCs w:val="21"/>
         </w:rPr>
-        <w:t xml:space="preserve">Information Technology student and graphic designer who designs accessible digital interfaces and builds responsive front-end web applications that align with real business needs. Brings a year of graphic design for an International Esports organization, freelance product design for a local milk tea brand, and hands-on IT and network support experience, turning complex requirements into clear visual prototypes, polished layouts and clean, scalable front-end code.</w:t>
+        <w:t xml:space="preserve">Graphic designer with an Information Technology background who designs accessible digital interfaces and builds responsive front-end web applications that align with real business needs. Brings two years of graphic design for an International Esports organization, a year each of product and packaging design for a local cosmetics brand and a local milk tea brand, and hands-on IT and network support experience, turning complex requirements into clear visual prototypes, polished layouts and clean, scalable front-end code.</w:t>
       </w:r>
     </w:p>
     <w:p>
@@ -211,7 +211,7 @@
           <w:sz w:val="21"/>
           <w:szCs w:val="21"/>
         </w:rPr>
-        <w:t xml:space="preserve">	Oct 2025 – Present (1 yr)</w:t>
+        <w:t xml:space="preserve">	Oct 2024 – Present (2 yrs)</w:t>
       </w:r>
     </w:p>
     <w:p>
@@ -268,18 +268,18 @@
           <w:sz w:val="21"/>
           <w:szCs w:val="21"/>
         </w:rPr>
-        <w:t xml:space="preserve">Freelance Graphic Designer — Super Daddy Milk Tea Shop</w:t>
-      </w:r>
-      <w:r>
-        <w:rPr>
-          <w:rFonts w:ascii="Calibri" w:cs="Calibri" w:eastAsia="Calibri" w:hAnsi="Calibri"/>
-          <w:b/>
-          <w:bCs/>
-          <w:color w:val="000000"/>
-          <w:sz w:val="21"/>
-          <w:szCs w:val="21"/>
-        </w:rPr>
-        <w:t xml:space="preserve">	Aug 2025 – Feb 2026 (6 mos)</w:t>
+        <w:t xml:space="preserve">Graphic Designer — Sugar Dolls (Local Cosmetic Products)</w:t>
+      </w:r>
+      <w:r>
+        <w:rPr>
+          <w:rFonts w:ascii="Calibri" w:cs="Calibri" w:eastAsia="Calibri" w:hAnsi="Calibri"/>
+          <w:b/>
+          <w:bCs/>
+          <w:color w:val="000000"/>
+          <w:sz w:val="21"/>
+          <w:szCs w:val="21"/>
+        </w:rPr>
+        <w:t xml:space="preserve">	1 yr</w:t>
       </w:r>
     </w:p>
     <w:p>
@@ -298,7 +298,7 @@
           <w:sz w:val="21"/>
           <w:szCs w:val="21"/>
         </w:rPr>
-        <w:t xml:space="preserve">Designed product posters for the shop’s coffee, milk tea, and frappe lines, featuring signature flavors and seasonal drink offerings.</w:t>
+        <w:t xml:space="preserve">Designed packaging for a Lip &amp; Cheek Gel Tint, including a print-ready box dieline, brand board (color palette and typography) and 3D product mockups.</w:t>
       </w:r>
     </w:p>
     <w:p>
@@ -317,7 +317,7 @@
           <w:sz w:val="21"/>
           <w:szCs w:val="21"/>
         </w:rPr>
-        <w:t xml:space="preserve">Created social media promotions with product photo retouching, price callouts and bilingual (English–Filipino) copy, giving each drink its own bold color theme.</w:t>
+        <w:t xml:space="preserve">Created social media ads for the brand’s perfume and wellness products.</w:t>
       </w:r>
     </w:p>
     <w:p>
@@ -336,34 +336,18 @@
           <w:sz w:val="21"/>
           <w:szCs w:val="21"/>
         </w:rPr>
-        <w:t xml:space="preserve">Technical &amp; Network Support Intern — PTSI Philippines</w:t>
-      </w:r>
-      <w:r>
-        <w:rPr>
-          <w:rFonts w:ascii="Calibri" w:cs="Calibri" w:eastAsia="Calibri" w:hAnsi="Calibri"/>
-          <w:b/>
-          <w:bCs/>
-          <w:color w:val="000000"/>
-          <w:sz w:val="21"/>
-          <w:szCs w:val="21"/>
-        </w:rPr>
-        <w:t xml:space="preserve">	Jun 2026 – Oct 2026</w:t>
-      </w:r>
-    </w:p>
-    <w:p>
-      <w:pPr>
-        <w:spacing w:after="40"/>
-      </w:pPr>
-      <w:r>
-        <w:rPr>
-          <w:rFonts w:ascii="Calibri" w:cs="Calibri" w:eastAsia="Calibri" w:hAnsi="Calibri"/>
-          <w:i/>
-          <w:iCs/>
-          <w:color w:val="000000"/>
-          <w:sz w:val="21"/>
-          <w:szCs w:val="21"/>
-        </w:rPr>
-        <w:t xml:space="preserve">Productivity Technologies Services, Inc.</w:t>
+        <w:t xml:space="preserve">Graphic Designer — Super Daddy Milk Tea Shop</w:t>
+      </w:r>
+      <w:r>
+        <w:rPr>
+          <w:rFonts w:ascii="Calibri" w:cs="Calibri" w:eastAsia="Calibri" w:hAnsi="Calibri"/>
+          <w:b/>
+          <w:bCs/>
+          <w:color w:val="000000"/>
+          <w:sz w:val="21"/>
+          <w:szCs w:val="21"/>
+        </w:rPr>
+        <w:t xml:space="preserve">	1 yr</w:t>
       </w:r>
     </w:p>
     <w:p>
@@ -382,7 +366,7 @@
           <w:sz w:val="21"/>
           <w:szCs w:val="21"/>
         </w:rPr>
-        <w:t xml:space="preserve">Supported day-to-day IT operations, troubleshooting hardware, software and network issues.</w:t>
+        <w:t xml:space="preserve">Designed product posters for the shop’s coffee, milk tea, and frappe lines, featuring signature flavors and seasonal drink offerings.</w:t>
       </w:r>
     </w:p>
     <w:p>
@@ -401,26 +385,7 @@
           <w:sz w:val="21"/>
           <w:szCs w:val="21"/>
         </w:rPr>
-        <w:t xml:space="preserve">Designed and developed the company’s official website using modern web development standards.</w:t>
-      </w:r>
-    </w:p>
-    <w:p>
-      <w:pPr>
-        <w:pBdr>
-          <w:bottom w:val="single" w:color="8E1616" w:sz="6" w:space="2"/>
-        </w:pBdr>
-        <w:spacing w:after="80" w:before="220"/>
-      </w:pPr>
-      <w:r>
-        <w:rPr>
-          <w:rFonts w:ascii="Calibri" w:cs="Calibri" w:eastAsia="Calibri" w:hAnsi="Calibri"/>
-          <w:b/>
-          <w:bCs/>
-          <w:color w:val="8E1616"/>
-          <w:sz w:val="23"/>
-          <w:szCs w:val="23"/>
-        </w:rPr>
-        <w:t xml:space="preserve">PROJECTS</w:t>
+        <w:t xml:space="preserve">Created social media promotions with product photo retouching, price callouts and bilingual (English–Filipino) copy, giving each drink its own bold color theme.</w:t>
       </w:r>
     </w:p>
     <w:p>
@@ -439,18 +404,34 @@
           <w:sz w:val="21"/>
           <w:szCs w:val="21"/>
         </w:rPr>
-        <w:t xml:space="preserve">PTSI Corporate Website — Web Designer &amp; Developer</w:t>
-      </w:r>
-      <w:r>
-        <w:rPr>
-          <w:rFonts w:ascii="Calibri" w:cs="Calibri" w:eastAsia="Calibri" w:hAnsi="Calibri"/>
-          <w:b/>
-          <w:bCs/>
-          <w:color w:val="000000"/>
-          <w:sz w:val="21"/>
-          <w:szCs w:val="21"/>
-        </w:rPr>
-        <w:t xml:space="preserve">	2026</w:t>
+        <w:t xml:space="preserve">Technical &amp; Network Support Intern — PTSI Philippines</w:t>
+      </w:r>
+      <w:r>
+        <w:rPr>
+          <w:rFonts w:ascii="Calibri" w:cs="Calibri" w:eastAsia="Calibri" w:hAnsi="Calibri"/>
+          <w:b/>
+          <w:bCs/>
+          <w:color w:val="000000"/>
+          <w:sz w:val="21"/>
+          <w:szCs w:val="21"/>
+        </w:rPr>
+        <w:t xml:space="preserve">	Jun 2026 – Oct 2026</w:t>
+      </w:r>
+    </w:p>
+    <w:p>
+      <w:pPr>
+        <w:spacing w:after="40"/>
+      </w:pPr>
+      <w:r>
+        <w:rPr>
+          <w:rFonts w:ascii="Calibri" w:cs="Calibri" w:eastAsia="Calibri" w:hAnsi="Calibri"/>
+          <w:i/>
+          <w:iCs/>
+          <w:color w:val="000000"/>
+          <w:sz w:val="21"/>
+          <w:szCs w:val="21"/>
+        </w:rPr>
+        <w:t xml:space="preserve">Productivity Technologies Services, Inc.</w:t>
       </w:r>
     </w:p>
     <w:p>
@@ -469,6 +450,93 @@
           <w:sz w:val="21"/>
           <w:szCs w:val="21"/>
         </w:rPr>
+        <w:t xml:space="preserve">Supported day-to-day IT operations, troubleshooting hardware, software and network issues.</w:t>
+      </w:r>
+    </w:p>
+    <w:p>
+      <w:pPr>
+        <w:pStyle w:val="ListParagraph"/>
+        <w:numPr>
+          <w:ilvl w:val="0"/>
+          <w:numId w:val="2"/>
+        </w:numPr>
+        <w:spacing w:after="40"/>
+      </w:pPr>
+      <w:r>
+        <w:rPr>
+          <w:rFonts w:ascii="Calibri" w:cs="Calibri" w:eastAsia="Calibri" w:hAnsi="Calibri"/>
+          <w:color w:val="000000"/>
+          <w:sz w:val="21"/>
+          <w:szCs w:val="21"/>
+        </w:rPr>
+        <w:t xml:space="preserve">Designed and developed the company’s official website using modern web development standards.</w:t>
+      </w:r>
+    </w:p>
+    <w:p>
+      <w:pPr>
+        <w:pBdr>
+          <w:bottom w:val="single" w:color="8E1616" w:sz="6" w:space="2"/>
+        </w:pBdr>
+        <w:spacing w:after="80" w:before="220"/>
+      </w:pPr>
+      <w:r>
+        <w:rPr>
+          <w:rFonts w:ascii="Calibri" w:cs="Calibri" w:eastAsia="Calibri" w:hAnsi="Calibri"/>
+          <w:b/>
+          <w:bCs/>
+          <w:color w:val="8E1616"/>
+          <w:sz w:val="23"/>
+          <w:szCs w:val="23"/>
+        </w:rPr>
+        <w:t xml:space="preserve">PROJECTS</w:t>
+      </w:r>
+    </w:p>
+    <w:p>
+      <w:pPr>
+        <w:tabs>
+          <w:tab w:val="right" w:pos="10466"/>
+        </w:tabs>
+        <w:spacing w:after="0" w:before="120"/>
+      </w:pPr>
+      <w:r>
+        <w:rPr>
+          <w:rFonts w:ascii="Calibri" w:cs="Calibri" w:eastAsia="Calibri" w:hAnsi="Calibri"/>
+          <w:b/>
+          <w:bCs/>
+          <w:color w:val="000000"/>
+          <w:sz w:val="21"/>
+          <w:szCs w:val="21"/>
+        </w:rPr>
+        <w:t xml:space="preserve">PTSI Corporate Website — Web Designer &amp; Developer</w:t>
+      </w:r>
+      <w:r>
+        <w:rPr>
+          <w:rFonts w:ascii="Calibri" w:cs="Calibri" w:eastAsia="Calibri" w:hAnsi="Calibri"/>
+          <w:b/>
+          <w:bCs/>
+          <w:color w:val="000000"/>
+          <w:sz w:val="21"/>
+          <w:szCs w:val="21"/>
+        </w:rPr>
+        <w:t xml:space="preserve">	2026</w:t>
+      </w:r>
+    </w:p>
+    <w:p>
+      <w:pPr>
+        <w:pStyle w:val="ListParagraph"/>
+        <w:numPr>
+          <w:ilvl w:val="0"/>
+          <w:numId w:val="2"/>
+        </w:numPr>
+        <w:spacing w:after="40"/>
+      </w:pPr>
+      <w:r>
+        <w:rPr>
+          <w:rFonts w:ascii="Calibri" w:cs="Calibri" w:eastAsia="Calibri" w:hAnsi="Calibri"/>
+          <w:color w:val="000000"/>
+          <w:sz w:val="21"/>
+          <w:szCs w:val="21"/>
+        </w:rPr>
         <w:t xml:space="preserve">Designed and developed a responsive corporate website for an IT products and services company, covering About Us, Partners, Products, Services, News, Careers and Contact.</w:t>
       </w:r>
     </w:p>
@@ -487,7 +555,7 @@
         </w:rPr>
         <w:t xml:space="preserve">Live: </w:t>
       </w:r>
-      <w:hyperlink w:history="1" r:id="rId7dxdyhbplhxcnsldqrbxz">
+      <w:hyperlink w:history="1" r:id="rIdkq3jwer0qao_frcx8gjrw">
         <w:r>
           <w:rPr>
             <w:rFonts w:ascii="Calibri" w:cs="Calibri" w:eastAsia="Calibri" w:hAnsi="Calibri"/>
@@ -564,7 +632,7 @@
         </w:rPr>
         <w:t xml:space="preserve">Live: </w:t>
       </w:r>
-      <w:hyperlink w:history="1" r:id="rId7bl3m21wpyemm9w4jobhe">
+      <w:hyperlink w:history="1" r:id="rId79afme65lzoptdnitmdlg">
         <w:r>
           <w:rPr>
             <w:rFonts w:ascii="Calibri" w:cs="Calibri" w:eastAsia="Calibri" w:hAnsi="Calibri"/>
@@ -624,71 +692,6 @@
           <w:szCs w:val="21"/>
         </w:rPr>
         <w:t xml:space="preserve">Designed and coded an interactive, responsive portfolio in HTML, CSS and JavaScript, deployed on Vercel.</w:t>
-      </w:r>
-    </w:p>
-    <w:p>
-      <w:pPr>
-        <w:pBdr>
-          <w:bottom w:val="single" w:color="8E1616" w:sz="6" w:space="2"/>
-        </w:pBdr>
-        <w:spacing w:after="80" w:before="220"/>
-      </w:pPr>
-      <w:r>
-        <w:rPr>
-          <w:rFonts w:ascii="Calibri" w:cs="Calibri" w:eastAsia="Calibri" w:hAnsi="Calibri"/>
-          <w:b/>
-          <w:bCs/>
-          <w:color w:val="8E1616"/>
-          <w:sz w:val="23"/>
-          <w:szCs w:val="23"/>
-        </w:rPr>
-        <w:t xml:space="preserve">EDUCATION</w:t>
-      </w:r>
-    </w:p>
-    <w:p>
-      <w:pPr>
-        <w:tabs>
-          <w:tab w:val="right" w:pos="10466"/>
-        </w:tabs>
-        <w:spacing w:after="0" w:before="120"/>
-      </w:pPr>
-      <w:r>
-        <w:rPr>
-          <w:rFonts w:ascii="Calibri" w:cs="Calibri" w:eastAsia="Calibri" w:hAnsi="Calibri"/>
-          <w:b/>
-          <w:bCs/>
-          <w:color w:val="000000"/>
-          <w:sz w:val="21"/>
-          <w:szCs w:val="21"/>
-        </w:rPr>
-        <w:t xml:space="preserve">Pamantasan ng Lungsod ng Valenzuela</w:t>
-      </w:r>
-      <w:r>
-        <w:rPr>
-          <w:rFonts w:ascii="Calibri" w:cs="Calibri" w:eastAsia="Calibri" w:hAnsi="Calibri"/>
-          <w:b/>
-          <w:bCs/>
-          <w:color w:val="000000"/>
-          <w:sz w:val="21"/>
-          <w:szCs w:val="21"/>
-        </w:rPr>
-        <w:t xml:space="preserve">	Present</w:t>
-      </w:r>
-    </w:p>
-    <w:p>
-      <w:pPr>
-        <w:spacing w:after="40"/>
-      </w:pPr>
-      <w:r>
-        <w:rPr>
-          <w:rFonts w:ascii="Calibri" w:cs="Calibri" w:eastAsia="Calibri" w:hAnsi="Calibri"/>
-          <w:i/>
-          <w:iCs/>
-          <w:color w:val="000000"/>
-          <w:sz w:val="21"/>
-          <w:szCs w:val="21"/>
-        </w:rPr>
-        <w:t xml:space="preserve">Information Technology — 4th Year Student</w:t>
       </w:r>
     </w:p>
     <w:p>

</xml_diff>